<commit_message>
Changes to Project Write-up
</commit_message>
<xml_diff>
--- a/Mobile App Project Write-up.docx
+++ b/Mobile App Project Write-up.docx
@@ -1359,10 +1359,10 @@
                 <w:noProof/>
               </w:rPr>
               <w:drawing>
-                <wp:inline distT="0" distB="0" distL="0" distR="0" wp14:anchorId="11DD87A5" wp14:editId="3345368A">
-                  <wp:extent cx="6188710" cy="3994785"/>
-                  <wp:effectExtent l="0" t="0" r="2540" b="5715"/>
-                  <wp:docPr id="1680108013" name="Picture 1"/>
+                <wp:inline distT="0" distB="0" distL="0" distR="0" wp14:anchorId="6564EF45" wp14:editId="561F951A">
+                  <wp:extent cx="6188710" cy="3990975"/>
+                  <wp:effectExtent l="0" t="0" r="2540" b="9525"/>
+                  <wp:docPr id="174931307" name="Picture 1"/>
                   <wp:cNvGraphicFramePr>
                     <a:graphicFrameLocks xmlns:a="http://schemas.openxmlformats.org/drawingml/2006/main" noChangeAspect="1"/>
                   </wp:cNvGraphicFramePr>
@@ -1370,7 +1370,7 @@
                     <a:graphicData uri="http://schemas.openxmlformats.org/drawingml/2006/picture">
                       <pic:pic xmlns:pic="http://schemas.openxmlformats.org/drawingml/2006/picture">
                         <pic:nvPicPr>
-                          <pic:cNvPr id="1680108013" name="Picture 1"/>
+                          <pic:cNvPr id="174931307" name="Picture 174931307"/>
                           <pic:cNvPicPr/>
                         </pic:nvPicPr>
                         <pic:blipFill>
@@ -1388,7 +1388,7 @@
                         <pic:spPr>
                           <a:xfrm>
                             <a:off x="0" y="0"/>
-                            <a:ext cx="6188710" cy="3994785"/>
+                            <a:ext cx="6188710" cy="3990975"/>
                           </a:xfrm>
                           <a:prstGeom prst="rect">
                             <a:avLst/>
@@ -4015,37 +4015,10 @@
         </w:tc>
       </w:tr>
     </w:tbl>
-    <w:p/>
     <w:p>
       <w:pPr>
         <w:spacing w:after="120"/>
       </w:pPr>
-      <w:r>
-        <w:rPr>
-          <w:color w:val="666666"/>
-          <w:sz w:val="19"/>
-          <w:szCs w:val="19"/>
-        </w:rPr>
-        <w:t xml:space="preserve">Every client will ask what this costs. Provide a monthly estimate. Use the AWS Pricing Calculator at </w:t>
-      </w:r>
-      <w:proofErr w:type="spellStart"/>
-      <w:r>
-        <w:rPr>
-          <w:color w:val="666666"/>
-          <w:sz w:val="19"/>
-          <w:szCs w:val="19"/>
-        </w:rPr>
-        <w:t>calculator.aws</w:t>
-      </w:r>
-      <w:proofErr w:type="spellEnd"/>
-      <w:r>
-        <w:rPr>
-          <w:color w:val="666666"/>
-          <w:sz w:val="19"/>
-          <w:szCs w:val="19"/>
-        </w:rPr>
-        <w:t xml:space="preserve"> to verify figures. Round to 2 decimal places.</w:t>
-      </w:r>
     </w:p>
     <w:tbl>
       <w:tblPr>
@@ -4202,27 +4175,27 @@
               <w:bottom w:val="single" w:sz="1" w:space="0" w:color="D0CBC0"/>
               <w:right w:val="single" w:sz="1" w:space="0" w:color="D0CBC0"/>
             </w:tcBorders>
-            <w:shd w:val="clear" w:color="auto" w:fill="FFFFFF"/>
-            <w:tcMar>
-              <w:top w:w="80" w:type="dxa"/>
-              <w:left w:w="120" w:type="dxa"/>
-              <w:bottom w:w="80" w:type="dxa"/>
-              <w:right w:w="80" w:type="dxa"/>
-            </w:tcMar>
-          </w:tcPr>
-          <w:p>
-            <w:pPr>
-              <w:rPr>
-                <w:sz w:val="20"/>
-                <w:szCs w:val="20"/>
-              </w:rPr>
-            </w:pPr>
-            <w:r>
-              <w:rPr>
-                <w:sz w:val="20"/>
-                <w:szCs w:val="20"/>
-              </w:rPr>
-              <w:t>[AWS Service]</w:t>
+            <w:shd w:val="clear" w:color="auto" w:fill="FFFFFF" w:themeFill="background1"/>
+            <w:tcMar>
+              <w:top w:w="80" w:type="dxa"/>
+              <w:left w:w="120" w:type="dxa"/>
+              <w:bottom w:w="80" w:type="dxa"/>
+              <w:right w:w="80" w:type="dxa"/>
+            </w:tcMar>
+          </w:tcPr>
+          <w:p>
+            <w:pPr>
+              <w:rPr>
+                <w:sz w:val="20"/>
+                <w:szCs w:val="20"/>
+              </w:rPr>
+            </w:pPr>
+            <w:r>
+              <w:rPr>
+                <w:sz w:val="20"/>
+                <w:szCs w:val="20"/>
+              </w:rPr>
+              <w:t>Lambda</w:t>
             </w:r>
           </w:p>
         </w:tc>
@@ -4235,27 +4208,27 @@
               <w:bottom w:val="single" w:sz="1" w:space="0" w:color="D0CBC0"/>
               <w:right w:val="single" w:sz="1" w:space="0" w:color="D0CBC0"/>
             </w:tcBorders>
-            <w:shd w:val="clear" w:color="auto" w:fill="FFFFFF"/>
-            <w:tcMar>
-              <w:top w:w="80" w:type="dxa"/>
-              <w:left w:w="120" w:type="dxa"/>
-              <w:bottom w:w="80" w:type="dxa"/>
-              <w:right w:w="80" w:type="dxa"/>
-            </w:tcMar>
-          </w:tcPr>
-          <w:p>
-            <w:pPr>
-              <w:rPr>
-                <w:sz w:val="20"/>
-                <w:szCs w:val="20"/>
-              </w:rPr>
-            </w:pPr>
-            <w:r>
-              <w:rPr>
-                <w:sz w:val="20"/>
-                <w:szCs w:val="20"/>
-              </w:rPr>
-              <w:t>[e.g. 10,000 page views/month]</w:t>
+            <w:shd w:val="clear" w:color="auto" w:fill="FFFFFF" w:themeFill="background1"/>
+            <w:tcMar>
+              <w:top w:w="80" w:type="dxa"/>
+              <w:left w:w="120" w:type="dxa"/>
+              <w:bottom w:w="80" w:type="dxa"/>
+              <w:right w:w="80" w:type="dxa"/>
+            </w:tcMar>
+          </w:tcPr>
+          <w:p>
+            <w:pPr>
+              <w:rPr>
+                <w:sz w:val="20"/>
+                <w:szCs w:val="20"/>
+              </w:rPr>
+            </w:pPr>
+            <w:r>
+              <w:rPr>
+                <w:sz w:val="20"/>
+                <w:szCs w:val="20"/>
+              </w:rPr>
+              <w:t>100 requests/month</w:t>
             </w:r>
           </w:p>
         </w:tc>
@@ -4268,27 +4241,27 @@
               <w:bottom w:val="single" w:sz="1" w:space="0" w:color="D0CBC0"/>
               <w:right w:val="single" w:sz="1" w:space="0" w:color="D0CBC0"/>
             </w:tcBorders>
-            <w:shd w:val="clear" w:color="auto" w:fill="FFFFFF"/>
-            <w:tcMar>
-              <w:top w:w="80" w:type="dxa"/>
-              <w:left w:w="120" w:type="dxa"/>
-              <w:bottom w:w="80" w:type="dxa"/>
-              <w:right w:w="80" w:type="dxa"/>
-            </w:tcMar>
-          </w:tcPr>
-          <w:p>
-            <w:pPr>
-              <w:rPr>
-                <w:sz w:val="20"/>
-                <w:szCs w:val="20"/>
-              </w:rPr>
-            </w:pPr>
-            <w:r>
-              <w:rPr>
-                <w:sz w:val="20"/>
-                <w:szCs w:val="20"/>
-              </w:rPr>
-              <w:t>[e.g. £0.00]</w:t>
+            <w:shd w:val="clear" w:color="auto" w:fill="FFFFFF" w:themeFill="background1"/>
+            <w:tcMar>
+              <w:top w:w="80" w:type="dxa"/>
+              <w:left w:w="120" w:type="dxa"/>
+              <w:bottom w:w="80" w:type="dxa"/>
+              <w:right w:w="80" w:type="dxa"/>
+            </w:tcMar>
+          </w:tcPr>
+          <w:p>
+            <w:pPr>
+              <w:rPr>
+                <w:sz w:val="20"/>
+                <w:szCs w:val="20"/>
+              </w:rPr>
+            </w:pPr>
+            <w:r>
+              <w:rPr>
+                <w:sz w:val="20"/>
+                <w:szCs w:val="20"/>
+              </w:rPr>
+              <w:t>£0.00</w:t>
             </w:r>
           </w:p>
         </w:tc>
@@ -4301,27 +4274,27 @@
               <w:bottom w:val="single" w:sz="1" w:space="0" w:color="D0CBC0"/>
               <w:right w:val="single" w:sz="1" w:space="0" w:color="D0CBC0"/>
             </w:tcBorders>
-            <w:shd w:val="clear" w:color="auto" w:fill="FFFFFF"/>
-            <w:tcMar>
-              <w:top w:w="80" w:type="dxa"/>
-              <w:left w:w="120" w:type="dxa"/>
-              <w:bottom w:w="80" w:type="dxa"/>
-              <w:right w:w="80" w:type="dxa"/>
-            </w:tcMar>
-          </w:tcPr>
-          <w:p>
-            <w:pPr>
-              <w:rPr>
-                <w:sz w:val="20"/>
-                <w:szCs w:val="20"/>
-              </w:rPr>
-            </w:pPr>
-            <w:r>
-              <w:rPr>
-                <w:sz w:val="20"/>
-                <w:szCs w:val="20"/>
-              </w:rPr>
-              <w:t>[e.g. £0.50]</w:t>
+            <w:shd w:val="clear" w:color="auto" w:fill="FFFFFF" w:themeFill="background1"/>
+            <w:tcMar>
+              <w:top w:w="80" w:type="dxa"/>
+              <w:left w:w="120" w:type="dxa"/>
+              <w:bottom w:w="80" w:type="dxa"/>
+              <w:right w:w="80" w:type="dxa"/>
+            </w:tcMar>
+          </w:tcPr>
+          <w:p>
+            <w:pPr>
+              <w:rPr>
+                <w:sz w:val="20"/>
+                <w:szCs w:val="20"/>
+              </w:rPr>
+            </w:pPr>
+            <w:r>
+              <w:rPr>
+                <w:sz w:val="20"/>
+                <w:szCs w:val="20"/>
+              </w:rPr>
+              <w:t>£0.00</w:t>
             </w:r>
           </w:p>
         </w:tc>
@@ -4336,27 +4309,27 @@
               <w:bottom w:val="single" w:sz="1" w:space="0" w:color="D0CBC0"/>
               <w:right w:val="single" w:sz="1" w:space="0" w:color="D0CBC0"/>
             </w:tcBorders>
-            <w:shd w:val="clear" w:color="auto" w:fill="F5F0E8"/>
-            <w:tcMar>
-              <w:top w:w="80" w:type="dxa"/>
-              <w:left w:w="120" w:type="dxa"/>
-              <w:bottom w:w="80" w:type="dxa"/>
-              <w:right w:w="80" w:type="dxa"/>
-            </w:tcMar>
-          </w:tcPr>
-          <w:p>
-            <w:pPr>
-              <w:rPr>
-                <w:sz w:val="20"/>
-                <w:szCs w:val="20"/>
-              </w:rPr>
-            </w:pPr>
-            <w:r>
-              <w:rPr>
-                <w:sz w:val="20"/>
-                <w:szCs w:val="20"/>
-              </w:rPr>
-              <w:t>[AWS Service]</w:t>
+            <w:shd w:val="clear" w:color="auto" w:fill="FFFFFF" w:themeFill="background1"/>
+            <w:tcMar>
+              <w:top w:w="80" w:type="dxa"/>
+              <w:left w:w="120" w:type="dxa"/>
+              <w:bottom w:w="80" w:type="dxa"/>
+              <w:right w:w="80" w:type="dxa"/>
+            </w:tcMar>
+          </w:tcPr>
+          <w:p>
+            <w:pPr>
+              <w:rPr>
+                <w:sz w:val="20"/>
+                <w:szCs w:val="20"/>
+              </w:rPr>
+            </w:pPr>
+            <w:r>
+              <w:rPr>
+                <w:sz w:val="20"/>
+                <w:szCs w:val="20"/>
+              </w:rPr>
+              <w:t>DynamoDB</w:t>
             </w:r>
           </w:p>
         </w:tc>
@@ -4369,27 +4342,27 @@
               <w:bottom w:val="single" w:sz="1" w:space="0" w:color="D0CBC0"/>
               <w:right w:val="single" w:sz="1" w:space="0" w:color="D0CBC0"/>
             </w:tcBorders>
-            <w:shd w:val="clear" w:color="auto" w:fill="F5F0E8"/>
-            <w:tcMar>
-              <w:top w:w="80" w:type="dxa"/>
-              <w:left w:w="120" w:type="dxa"/>
-              <w:bottom w:w="80" w:type="dxa"/>
-              <w:right w:w="80" w:type="dxa"/>
-            </w:tcMar>
-          </w:tcPr>
-          <w:p>
-            <w:pPr>
-              <w:rPr>
-                <w:sz w:val="20"/>
-                <w:szCs w:val="20"/>
-              </w:rPr>
-            </w:pPr>
-            <w:r>
-              <w:rPr>
-                <w:sz w:val="20"/>
-                <w:szCs w:val="20"/>
-              </w:rPr>
-              <w:t>[usage]</w:t>
+            <w:shd w:val="clear" w:color="auto" w:fill="FFFFFF" w:themeFill="background1"/>
+            <w:tcMar>
+              <w:top w:w="80" w:type="dxa"/>
+              <w:left w:w="120" w:type="dxa"/>
+              <w:bottom w:w="80" w:type="dxa"/>
+              <w:right w:w="80" w:type="dxa"/>
+            </w:tcMar>
+          </w:tcPr>
+          <w:p>
+            <w:pPr>
+              <w:rPr>
+                <w:sz w:val="20"/>
+                <w:szCs w:val="20"/>
+              </w:rPr>
+            </w:pPr>
+            <w:r>
+              <w:rPr>
+                <w:sz w:val="20"/>
+                <w:szCs w:val="20"/>
+              </w:rPr>
+              <w:t>0.01GB storage</w:t>
             </w:r>
           </w:p>
         </w:tc>
@@ -4402,27 +4375,27 @@
               <w:bottom w:val="single" w:sz="1" w:space="0" w:color="D0CBC0"/>
               <w:right w:val="single" w:sz="1" w:space="0" w:color="D0CBC0"/>
             </w:tcBorders>
-            <w:shd w:val="clear" w:color="auto" w:fill="F5F0E8"/>
-            <w:tcMar>
-              <w:top w:w="80" w:type="dxa"/>
-              <w:left w:w="120" w:type="dxa"/>
-              <w:bottom w:w="80" w:type="dxa"/>
-              <w:right w:w="80" w:type="dxa"/>
-            </w:tcMar>
-          </w:tcPr>
-          <w:p>
-            <w:pPr>
-              <w:rPr>
-                <w:sz w:val="20"/>
-                <w:szCs w:val="20"/>
-              </w:rPr>
-            </w:pPr>
-            <w:r>
-              <w:rPr>
-                <w:sz w:val="20"/>
-                <w:szCs w:val="20"/>
-              </w:rPr>
-              <w:t>[£0.00]</w:t>
+            <w:shd w:val="clear" w:color="auto" w:fill="FFFFFF" w:themeFill="background1"/>
+            <w:tcMar>
+              <w:top w:w="80" w:type="dxa"/>
+              <w:left w:w="120" w:type="dxa"/>
+              <w:bottom w:w="80" w:type="dxa"/>
+              <w:right w:w="80" w:type="dxa"/>
+            </w:tcMar>
+          </w:tcPr>
+          <w:p>
+            <w:pPr>
+              <w:rPr>
+                <w:sz w:val="20"/>
+                <w:szCs w:val="20"/>
+              </w:rPr>
+            </w:pPr>
+            <w:r>
+              <w:rPr>
+                <w:sz w:val="20"/>
+                <w:szCs w:val="20"/>
+              </w:rPr>
+              <w:t>£0.00</w:t>
             </w:r>
           </w:p>
         </w:tc>
@@ -4435,27 +4408,27 @@
               <w:bottom w:val="single" w:sz="1" w:space="0" w:color="D0CBC0"/>
               <w:right w:val="single" w:sz="1" w:space="0" w:color="D0CBC0"/>
             </w:tcBorders>
-            <w:shd w:val="clear" w:color="auto" w:fill="F5F0E8"/>
-            <w:tcMar>
-              <w:top w:w="80" w:type="dxa"/>
-              <w:left w:w="120" w:type="dxa"/>
-              <w:bottom w:w="80" w:type="dxa"/>
-              <w:right w:w="80" w:type="dxa"/>
-            </w:tcMar>
-          </w:tcPr>
-          <w:p>
-            <w:pPr>
-              <w:rPr>
-                <w:sz w:val="20"/>
-                <w:szCs w:val="20"/>
-              </w:rPr>
-            </w:pPr>
-            <w:r>
-              <w:rPr>
-                <w:sz w:val="20"/>
-                <w:szCs w:val="20"/>
-              </w:rPr>
-              <w:t>[£X.XX]</w:t>
+            <w:shd w:val="clear" w:color="auto" w:fill="FFFFFF" w:themeFill="background1"/>
+            <w:tcMar>
+              <w:top w:w="80" w:type="dxa"/>
+              <w:left w:w="120" w:type="dxa"/>
+              <w:bottom w:w="80" w:type="dxa"/>
+              <w:right w:w="80" w:type="dxa"/>
+            </w:tcMar>
+          </w:tcPr>
+          <w:p>
+            <w:pPr>
+              <w:rPr>
+                <w:sz w:val="20"/>
+                <w:szCs w:val="20"/>
+              </w:rPr>
+            </w:pPr>
+            <w:r>
+              <w:rPr>
+                <w:sz w:val="20"/>
+                <w:szCs w:val="20"/>
+              </w:rPr>
+              <w:t>£0.00</w:t>
             </w:r>
           </w:p>
         </w:tc>
@@ -4470,27 +4443,27 @@
               <w:bottom w:val="single" w:sz="1" w:space="0" w:color="D0CBC0"/>
               <w:right w:val="single" w:sz="1" w:space="0" w:color="D0CBC0"/>
             </w:tcBorders>
-            <w:shd w:val="clear" w:color="auto" w:fill="FFFFFF"/>
-            <w:tcMar>
-              <w:top w:w="80" w:type="dxa"/>
-              <w:left w:w="120" w:type="dxa"/>
-              <w:bottom w:w="80" w:type="dxa"/>
-              <w:right w:w="80" w:type="dxa"/>
-            </w:tcMar>
-          </w:tcPr>
-          <w:p>
-            <w:pPr>
-              <w:rPr>
-                <w:sz w:val="20"/>
-                <w:szCs w:val="20"/>
-              </w:rPr>
-            </w:pPr>
-            <w:r>
-              <w:rPr>
-                <w:sz w:val="20"/>
-                <w:szCs w:val="20"/>
-              </w:rPr>
-              <w:t>[AWS Service]</w:t>
+            <w:shd w:val="clear" w:color="auto" w:fill="FFFFFF" w:themeFill="background1"/>
+            <w:tcMar>
+              <w:top w:w="80" w:type="dxa"/>
+              <w:left w:w="120" w:type="dxa"/>
+              <w:bottom w:w="80" w:type="dxa"/>
+              <w:right w:w="80" w:type="dxa"/>
+            </w:tcMar>
+          </w:tcPr>
+          <w:p>
+            <w:pPr>
+              <w:rPr>
+                <w:sz w:val="20"/>
+                <w:szCs w:val="20"/>
+              </w:rPr>
+            </w:pPr>
+            <w:r>
+              <w:rPr>
+                <w:sz w:val="20"/>
+                <w:szCs w:val="20"/>
+              </w:rPr>
+              <w:t>SNS</w:t>
             </w:r>
           </w:p>
         </w:tc>
@@ -4503,27 +4476,27 @@
               <w:bottom w:val="single" w:sz="1" w:space="0" w:color="D0CBC0"/>
               <w:right w:val="single" w:sz="1" w:space="0" w:color="D0CBC0"/>
             </w:tcBorders>
-            <w:shd w:val="clear" w:color="auto" w:fill="FFFFFF"/>
-            <w:tcMar>
-              <w:top w:w="80" w:type="dxa"/>
-              <w:left w:w="120" w:type="dxa"/>
-              <w:bottom w:w="80" w:type="dxa"/>
-              <w:right w:w="80" w:type="dxa"/>
-            </w:tcMar>
-          </w:tcPr>
-          <w:p>
-            <w:pPr>
-              <w:rPr>
-                <w:sz w:val="20"/>
-                <w:szCs w:val="20"/>
-              </w:rPr>
-            </w:pPr>
-            <w:r>
-              <w:rPr>
-                <w:sz w:val="20"/>
-                <w:szCs w:val="20"/>
-              </w:rPr>
-              <w:t>[usage]</w:t>
+            <w:shd w:val="clear" w:color="auto" w:fill="FFFFFF" w:themeFill="background1"/>
+            <w:tcMar>
+              <w:top w:w="80" w:type="dxa"/>
+              <w:left w:w="120" w:type="dxa"/>
+              <w:bottom w:w="80" w:type="dxa"/>
+              <w:right w:w="80" w:type="dxa"/>
+            </w:tcMar>
+          </w:tcPr>
+          <w:p>
+            <w:pPr>
+              <w:rPr>
+                <w:sz w:val="20"/>
+                <w:szCs w:val="20"/>
+              </w:rPr>
+            </w:pPr>
+            <w:r>
+              <w:rPr>
+                <w:sz w:val="20"/>
+                <w:szCs w:val="20"/>
+              </w:rPr>
+              <w:t>50 requests/month</w:t>
             </w:r>
           </w:p>
         </w:tc>
@@ -4536,27 +4509,27 @@
               <w:bottom w:val="single" w:sz="1" w:space="0" w:color="D0CBC0"/>
               <w:right w:val="single" w:sz="1" w:space="0" w:color="D0CBC0"/>
             </w:tcBorders>
-            <w:shd w:val="clear" w:color="auto" w:fill="FFFFFF"/>
-            <w:tcMar>
-              <w:top w:w="80" w:type="dxa"/>
-              <w:left w:w="120" w:type="dxa"/>
-              <w:bottom w:w="80" w:type="dxa"/>
-              <w:right w:w="80" w:type="dxa"/>
-            </w:tcMar>
-          </w:tcPr>
-          <w:p>
-            <w:pPr>
-              <w:rPr>
-                <w:sz w:val="20"/>
-                <w:szCs w:val="20"/>
-              </w:rPr>
-            </w:pPr>
-            <w:r>
-              <w:rPr>
-                <w:sz w:val="20"/>
-                <w:szCs w:val="20"/>
-              </w:rPr>
-              <w:t>[£0.00]</w:t>
+            <w:shd w:val="clear" w:color="auto" w:fill="FFFFFF" w:themeFill="background1"/>
+            <w:tcMar>
+              <w:top w:w="80" w:type="dxa"/>
+              <w:left w:w="120" w:type="dxa"/>
+              <w:bottom w:w="80" w:type="dxa"/>
+              <w:right w:w="80" w:type="dxa"/>
+            </w:tcMar>
+          </w:tcPr>
+          <w:p>
+            <w:pPr>
+              <w:rPr>
+                <w:sz w:val="20"/>
+                <w:szCs w:val="20"/>
+              </w:rPr>
+            </w:pPr>
+            <w:r>
+              <w:rPr>
+                <w:sz w:val="20"/>
+                <w:szCs w:val="20"/>
+              </w:rPr>
+              <w:t>£0.00</w:t>
             </w:r>
           </w:p>
         </w:tc>
@@ -4569,27 +4542,27 @@
               <w:bottom w:val="single" w:sz="1" w:space="0" w:color="D0CBC0"/>
               <w:right w:val="single" w:sz="1" w:space="0" w:color="D0CBC0"/>
             </w:tcBorders>
-            <w:shd w:val="clear" w:color="auto" w:fill="FFFFFF"/>
-            <w:tcMar>
-              <w:top w:w="80" w:type="dxa"/>
-              <w:left w:w="120" w:type="dxa"/>
-              <w:bottom w:w="80" w:type="dxa"/>
-              <w:right w:w="80" w:type="dxa"/>
-            </w:tcMar>
-          </w:tcPr>
-          <w:p>
-            <w:pPr>
-              <w:rPr>
-                <w:sz w:val="20"/>
-                <w:szCs w:val="20"/>
-              </w:rPr>
-            </w:pPr>
-            <w:r>
-              <w:rPr>
-                <w:sz w:val="20"/>
-                <w:szCs w:val="20"/>
-              </w:rPr>
-              <w:t>[£X.XX]</w:t>
+            <w:shd w:val="clear" w:color="auto" w:fill="FFFFFF" w:themeFill="background1"/>
+            <w:tcMar>
+              <w:top w:w="80" w:type="dxa"/>
+              <w:left w:w="120" w:type="dxa"/>
+              <w:bottom w:w="80" w:type="dxa"/>
+              <w:right w:w="80" w:type="dxa"/>
+            </w:tcMar>
+          </w:tcPr>
+          <w:p>
+            <w:pPr>
+              <w:rPr>
+                <w:sz w:val="20"/>
+                <w:szCs w:val="20"/>
+              </w:rPr>
+            </w:pPr>
+            <w:r>
+              <w:rPr>
+                <w:sz w:val="20"/>
+                <w:szCs w:val="20"/>
+              </w:rPr>
+              <w:t>£0.00</w:t>
             </w:r>
           </w:p>
         </w:tc>
@@ -4604,27 +4577,27 @@
               <w:bottom w:val="single" w:sz="1" w:space="0" w:color="D0CBC0"/>
               <w:right w:val="single" w:sz="1" w:space="0" w:color="D0CBC0"/>
             </w:tcBorders>
-            <w:shd w:val="clear" w:color="auto" w:fill="F5F0E8"/>
-            <w:tcMar>
-              <w:top w:w="80" w:type="dxa"/>
-              <w:left w:w="120" w:type="dxa"/>
-              <w:bottom w:w="80" w:type="dxa"/>
-              <w:right w:w="80" w:type="dxa"/>
-            </w:tcMar>
-          </w:tcPr>
-          <w:p>
-            <w:pPr>
-              <w:rPr>
-                <w:sz w:val="20"/>
-                <w:szCs w:val="20"/>
-              </w:rPr>
-            </w:pPr>
-            <w:r>
-              <w:rPr>
-                <w:sz w:val="20"/>
-                <w:szCs w:val="20"/>
-              </w:rPr>
-              <w:t>[AWS Service]</w:t>
+            <w:shd w:val="clear" w:color="auto" w:fill="FFFFFF" w:themeFill="background1"/>
+            <w:tcMar>
+              <w:top w:w="80" w:type="dxa"/>
+              <w:left w:w="120" w:type="dxa"/>
+              <w:bottom w:w="80" w:type="dxa"/>
+              <w:right w:w="80" w:type="dxa"/>
+            </w:tcMar>
+          </w:tcPr>
+          <w:p>
+            <w:pPr>
+              <w:rPr>
+                <w:sz w:val="20"/>
+                <w:szCs w:val="20"/>
+              </w:rPr>
+            </w:pPr>
+            <w:r>
+              <w:rPr>
+                <w:sz w:val="20"/>
+                <w:szCs w:val="20"/>
+              </w:rPr>
+              <w:t>API Gateway</w:t>
             </w:r>
           </w:p>
         </w:tc>
@@ -4637,27 +4610,27 @@
               <w:bottom w:val="single" w:sz="1" w:space="0" w:color="D0CBC0"/>
               <w:right w:val="single" w:sz="1" w:space="0" w:color="D0CBC0"/>
             </w:tcBorders>
-            <w:shd w:val="clear" w:color="auto" w:fill="F5F0E8"/>
-            <w:tcMar>
-              <w:top w:w="80" w:type="dxa"/>
-              <w:left w:w="120" w:type="dxa"/>
-              <w:bottom w:w="80" w:type="dxa"/>
-              <w:right w:w="80" w:type="dxa"/>
-            </w:tcMar>
-          </w:tcPr>
-          <w:p>
-            <w:pPr>
-              <w:rPr>
-                <w:sz w:val="20"/>
-                <w:szCs w:val="20"/>
-              </w:rPr>
-            </w:pPr>
-            <w:r>
-              <w:rPr>
-                <w:sz w:val="20"/>
-                <w:szCs w:val="20"/>
-              </w:rPr>
-              <w:t>[usage]</w:t>
+            <w:shd w:val="clear" w:color="auto" w:fill="FFFFFF" w:themeFill="background1"/>
+            <w:tcMar>
+              <w:top w:w="80" w:type="dxa"/>
+              <w:left w:w="120" w:type="dxa"/>
+              <w:bottom w:w="80" w:type="dxa"/>
+              <w:right w:w="80" w:type="dxa"/>
+            </w:tcMar>
+          </w:tcPr>
+          <w:p>
+            <w:pPr>
+              <w:rPr>
+                <w:sz w:val="20"/>
+                <w:szCs w:val="20"/>
+              </w:rPr>
+            </w:pPr>
+            <w:r>
+              <w:rPr>
+                <w:sz w:val="20"/>
+                <w:szCs w:val="20"/>
+              </w:rPr>
+              <w:t>100 requests/month</w:t>
             </w:r>
           </w:p>
         </w:tc>
@@ -4670,27 +4643,27 @@
               <w:bottom w:val="single" w:sz="1" w:space="0" w:color="D0CBC0"/>
               <w:right w:val="single" w:sz="1" w:space="0" w:color="D0CBC0"/>
             </w:tcBorders>
-            <w:shd w:val="clear" w:color="auto" w:fill="F5F0E8"/>
-            <w:tcMar>
-              <w:top w:w="80" w:type="dxa"/>
-              <w:left w:w="120" w:type="dxa"/>
-              <w:bottom w:w="80" w:type="dxa"/>
-              <w:right w:w="80" w:type="dxa"/>
-            </w:tcMar>
-          </w:tcPr>
-          <w:p>
-            <w:pPr>
-              <w:rPr>
-                <w:sz w:val="20"/>
-                <w:szCs w:val="20"/>
-              </w:rPr>
-            </w:pPr>
-            <w:r>
-              <w:rPr>
-                <w:sz w:val="20"/>
-                <w:szCs w:val="20"/>
-              </w:rPr>
-              <w:t>[£0.00]</w:t>
+            <w:shd w:val="clear" w:color="auto" w:fill="FFFFFF" w:themeFill="background1"/>
+            <w:tcMar>
+              <w:top w:w="80" w:type="dxa"/>
+              <w:left w:w="120" w:type="dxa"/>
+              <w:bottom w:w="80" w:type="dxa"/>
+              <w:right w:w="80" w:type="dxa"/>
+            </w:tcMar>
+          </w:tcPr>
+          <w:p>
+            <w:pPr>
+              <w:rPr>
+                <w:sz w:val="20"/>
+                <w:szCs w:val="20"/>
+              </w:rPr>
+            </w:pPr>
+            <w:r>
+              <w:rPr>
+                <w:sz w:val="20"/>
+                <w:szCs w:val="20"/>
+              </w:rPr>
+              <w:t>£0.00</w:t>
             </w:r>
           </w:p>
         </w:tc>
@@ -4703,27 +4676,27 @@
               <w:bottom w:val="single" w:sz="1" w:space="0" w:color="D0CBC0"/>
               <w:right w:val="single" w:sz="1" w:space="0" w:color="D0CBC0"/>
             </w:tcBorders>
-            <w:shd w:val="clear" w:color="auto" w:fill="F5F0E8"/>
-            <w:tcMar>
-              <w:top w:w="80" w:type="dxa"/>
-              <w:left w:w="120" w:type="dxa"/>
-              <w:bottom w:w="80" w:type="dxa"/>
-              <w:right w:w="80" w:type="dxa"/>
-            </w:tcMar>
-          </w:tcPr>
-          <w:p>
-            <w:pPr>
-              <w:rPr>
-                <w:sz w:val="20"/>
-                <w:szCs w:val="20"/>
-              </w:rPr>
-            </w:pPr>
-            <w:r>
-              <w:rPr>
-                <w:sz w:val="20"/>
-                <w:szCs w:val="20"/>
-              </w:rPr>
-              <w:t>[£X.XX]</w:t>
+            <w:shd w:val="clear" w:color="auto" w:fill="FFFFFF" w:themeFill="background1"/>
+            <w:tcMar>
+              <w:top w:w="80" w:type="dxa"/>
+              <w:left w:w="120" w:type="dxa"/>
+              <w:bottom w:w="80" w:type="dxa"/>
+              <w:right w:w="80" w:type="dxa"/>
+            </w:tcMar>
+          </w:tcPr>
+          <w:p>
+            <w:pPr>
+              <w:rPr>
+                <w:sz w:val="20"/>
+                <w:szCs w:val="20"/>
+              </w:rPr>
+            </w:pPr>
+            <w:r>
+              <w:rPr>
+                <w:sz w:val="20"/>
+                <w:szCs w:val="20"/>
+              </w:rPr>
+              <w:t>£0.00</w:t>
             </w:r>
           </w:p>
         </w:tc>
@@ -4738,27 +4711,27 @@
               <w:bottom w:val="single" w:sz="1" w:space="0" w:color="D0CBC0"/>
               <w:right w:val="single" w:sz="1" w:space="0" w:color="D0CBC0"/>
             </w:tcBorders>
-            <w:shd w:val="clear" w:color="auto" w:fill="FFFFFF"/>
-            <w:tcMar>
-              <w:top w:w="80" w:type="dxa"/>
-              <w:left w:w="120" w:type="dxa"/>
-              <w:bottom w:w="80" w:type="dxa"/>
-              <w:right w:w="80" w:type="dxa"/>
-            </w:tcMar>
-          </w:tcPr>
-          <w:p>
-            <w:pPr>
-              <w:rPr>
-                <w:sz w:val="20"/>
-                <w:szCs w:val="20"/>
-              </w:rPr>
-            </w:pPr>
-            <w:r>
-              <w:rPr>
-                <w:sz w:val="20"/>
-                <w:szCs w:val="20"/>
-              </w:rPr>
-              <w:t>[AWS Service]</w:t>
+            <w:shd w:val="clear" w:color="auto" w:fill="FFFFFF" w:themeFill="background1"/>
+            <w:tcMar>
+              <w:top w:w="80" w:type="dxa"/>
+              <w:left w:w="120" w:type="dxa"/>
+              <w:bottom w:w="80" w:type="dxa"/>
+              <w:right w:w="80" w:type="dxa"/>
+            </w:tcMar>
+          </w:tcPr>
+          <w:p>
+            <w:pPr>
+              <w:rPr>
+                <w:sz w:val="20"/>
+                <w:szCs w:val="20"/>
+              </w:rPr>
+            </w:pPr>
+            <w:r>
+              <w:rPr>
+                <w:sz w:val="20"/>
+                <w:szCs w:val="20"/>
+              </w:rPr>
+              <w:t>Cognito</w:t>
             </w:r>
           </w:p>
         </w:tc>
@@ -4771,27 +4744,27 @@
               <w:bottom w:val="single" w:sz="1" w:space="0" w:color="D0CBC0"/>
               <w:right w:val="single" w:sz="1" w:space="0" w:color="D0CBC0"/>
             </w:tcBorders>
-            <w:shd w:val="clear" w:color="auto" w:fill="FFFFFF"/>
-            <w:tcMar>
-              <w:top w:w="80" w:type="dxa"/>
-              <w:left w:w="120" w:type="dxa"/>
-              <w:bottom w:w="80" w:type="dxa"/>
-              <w:right w:w="80" w:type="dxa"/>
-            </w:tcMar>
-          </w:tcPr>
-          <w:p>
-            <w:pPr>
-              <w:rPr>
-                <w:sz w:val="20"/>
-                <w:szCs w:val="20"/>
-              </w:rPr>
-            </w:pPr>
-            <w:r>
-              <w:rPr>
-                <w:sz w:val="20"/>
-                <w:szCs w:val="20"/>
-              </w:rPr>
-              <w:t>[usage]</w:t>
+            <w:shd w:val="clear" w:color="auto" w:fill="FFFFFF" w:themeFill="background1"/>
+            <w:tcMar>
+              <w:top w:w="80" w:type="dxa"/>
+              <w:left w:w="120" w:type="dxa"/>
+              <w:bottom w:w="80" w:type="dxa"/>
+              <w:right w:w="80" w:type="dxa"/>
+            </w:tcMar>
+          </w:tcPr>
+          <w:p>
+            <w:pPr>
+              <w:rPr>
+                <w:sz w:val="20"/>
+                <w:szCs w:val="20"/>
+              </w:rPr>
+            </w:pPr>
+            <w:r>
+              <w:rPr>
+                <w:sz w:val="20"/>
+                <w:szCs w:val="20"/>
+              </w:rPr>
+              <w:t>50 MAUs</w:t>
             </w:r>
           </w:p>
         </w:tc>
@@ -4804,27 +4777,27 @@
               <w:bottom w:val="single" w:sz="1" w:space="0" w:color="D0CBC0"/>
               <w:right w:val="single" w:sz="1" w:space="0" w:color="D0CBC0"/>
             </w:tcBorders>
-            <w:shd w:val="clear" w:color="auto" w:fill="FFFFFF"/>
-            <w:tcMar>
-              <w:top w:w="80" w:type="dxa"/>
-              <w:left w:w="120" w:type="dxa"/>
-              <w:bottom w:w="80" w:type="dxa"/>
-              <w:right w:w="80" w:type="dxa"/>
-            </w:tcMar>
-          </w:tcPr>
-          <w:p>
-            <w:pPr>
-              <w:rPr>
-                <w:sz w:val="20"/>
-                <w:szCs w:val="20"/>
-              </w:rPr>
-            </w:pPr>
-            <w:r>
-              <w:rPr>
-                <w:sz w:val="20"/>
-                <w:szCs w:val="20"/>
-              </w:rPr>
-              <w:t>[£0.00]</w:t>
+            <w:shd w:val="clear" w:color="auto" w:fill="FFFFFF" w:themeFill="background1"/>
+            <w:tcMar>
+              <w:top w:w="80" w:type="dxa"/>
+              <w:left w:w="120" w:type="dxa"/>
+              <w:bottom w:w="80" w:type="dxa"/>
+              <w:right w:w="80" w:type="dxa"/>
+            </w:tcMar>
+          </w:tcPr>
+          <w:p>
+            <w:pPr>
+              <w:rPr>
+                <w:sz w:val="20"/>
+                <w:szCs w:val="20"/>
+              </w:rPr>
+            </w:pPr>
+            <w:r>
+              <w:rPr>
+                <w:sz w:val="20"/>
+                <w:szCs w:val="20"/>
+              </w:rPr>
+              <w:t>£0.00</w:t>
             </w:r>
           </w:p>
         </w:tc>
@@ -4837,27 +4810,27 @@
               <w:bottom w:val="single" w:sz="1" w:space="0" w:color="D0CBC0"/>
               <w:right w:val="single" w:sz="1" w:space="0" w:color="D0CBC0"/>
             </w:tcBorders>
-            <w:shd w:val="clear" w:color="auto" w:fill="FFFFFF"/>
-            <w:tcMar>
-              <w:top w:w="80" w:type="dxa"/>
-              <w:left w:w="120" w:type="dxa"/>
-              <w:bottom w:w="80" w:type="dxa"/>
-              <w:right w:w="80" w:type="dxa"/>
-            </w:tcMar>
-          </w:tcPr>
-          <w:p>
-            <w:pPr>
-              <w:rPr>
-                <w:sz w:val="20"/>
-                <w:szCs w:val="20"/>
-              </w:rPr>
-            </w:pPr>
-            <w:r>
-              <w:rPr>
-                <w:sz w:val="20"/>
-                <w:szCs w:val="20"/>
-              </w:rPr>
-              <w:t>[£X.XX]</w:t>
+            <w:shd w:val="clear" w:color="auto" w:fill="FFFFFF" w:themeFill="background1"/>
+            <w:tcMar>
+              <w:top w:w="80" w:type="dxa"/>
+              <w:left w:w="120" w:type="dxa"/>
+              <w:bottom w:w="80" w:type="dxa"/>
+              <w:right w:w="80" w:type="dxa"/>
+            </w:tcMar>
+          </w:tcPr>
+          <w:p>
+            <w:pPr>
+              <w:rPr>
+                <w:sz w:val="20"/>
+                <w:szCs w:val="20"/>
+              </w:rPr>
+            </w:pPr>
+            <w:r>
+              <w:rPr>
+                <w:sz w:val="20"/>
+                <w:szCs w:val="20"/>
+              </w:rPr>
+              <w:t>£0.00</w:t>
             </w:r>
           </w:p>
         </w:tc>
@@ -4872,27 +4845,27 @@
               <w:bottom w:val="single" w:sz="1" w:space="0" w:color="D0CBC0"/>
               <w:right w:val="single" w:sz="1" w:space="0" w:color="D0CBC0"/>
             </w:tcBorders>
-            <w:shd w:val="clear" w:color="auto" w:fill="F5F0E8"/>
-            <w:tcMar>
-              <w:top w:w="80" w:type="dxa"/>
-              <w:left w:w="120" w:type="dxa"/>
-              <w:bottom w:w="80" w:type="dxa"/>
-              <w:right w:w="80" w:type="dxa"/>
-            </w:tcMar>
-          </w:tcPr>
-          <w:p>
-            <w:pPr>
-              <w:rPr>
-                <w:sz w:val="20"/>
-                <w:szCs w:val="20"/>
-              </w:rPr>
-            </w:pPr>
-            <w:r>
-              <w:rPr>
-                <w:sz w:val="20"/>
-                <w:szCs w:val="20"/>
-              </w:rPr>
-              <w:t>[Domain (optional)]</w:t>
+            <w:shd w:val="clear" w:color="auto" w:fill="FFFFFF" w:themeFill="background1"/>
+            <w:tcMar>
+              <w:top w:w="80" w:type="dxa"/>
+              <w:left w:w="120" w:type="dxa"/>
+              <w:bottom w:w="80" w:type="dxa"/>
+              <w:right w:w="80" w:type="dxa"/>
+            </w:tcMar>
+          </w:tcPr>
+          <w:p>
+            <w:pPr>
+              <w:rPr>
+                <w:sz w:val="20"/>
+                <w:szCs w:val="20"/>
+              </w:rPr>
+            </w:pPr>
+            <w:r>
+              <w:rPr>
+                <w:sz w:val="20"/>
+                <w:szCs w:val="20"/>
+              </w:rPr>
+              <w:t>Amplify</w:t>
             </w:r>
           </w:p>
         </w:tc>
@@ -4905,27 +4878,27 @@
               <w:bottom w:val="single" w:sz="1" w:space="0" w:color="D0CBC0"/>
               <w:right w:val="single" w:sz="1" w:space="0" w:color="D0CBC0"/>
             </w:tcBorders>
-            <w:shd w:val="clear" w:color="auto" w:fill="F5F0E8"/>
-            <w:tcMar>
-              <w:top w:w="80" w:type="dxa"/>
-              <w:left w:w="120" w:type="dxa"/>
-              <w:bottom w:w="80" w:type="dxa"/>
-              <w:right w:w="80" w:type="dxa"/>
-            </w:tcMar>
-          </w:tcPr>
-          <w:p>
-            <w:pPr>
-              <w:rPr>
-                <w:sz w:val="20"/>
-                <w:szCs w:val="20"/>
-              </w:rPr>
-            </w:pPr>
-            <w:r>
-              <w:rPr>
-                <w:sz w:val="20"/>
-                <w:szCs w:val="20"/>
-              </w:rPr>
-              <w:t>[.co.uk domain + Route 53 hosted zone]</w:t>
+            <w:shd w:val="clear" w:color="auto" w:fill="FFFFFF" w:themeFill="background1"/>
+            <w:tcMar>
+              <w:top w:w="80" w:type="dxa"/>
+              <w:left w:w="120" w:type="dxa"/>
+              <w:bottom w:w="80" w:type="dxa"/>
+              <w:right w:w="80" w:type="dxa"/>
+            </w:tcMar>
+          </w:tcPr>
+          <w:p>
+            <w:pPr>
+              <w:rPr>
+                <w:sz w:val="20"/>
+                <w:szCs w:val="20"/>
+              </w:rPr>
+            </w:pPr>
+            <w:r>
+              <w:rPr>
+                <w:sz w:val="20"/>
+                <w:szCs w:val="20"/>
+              </w:rPr>
+              <w:t>100 build minutes/month</w:t>
             </w:r>
           </w:p>
         </w:tc>
@@ -4938,27 +4911,27 @@
               <w:bottom w:val="single" w:sz="1" w:space="0" w:color="D0CBC0"/>
               <w:right w:val="single" w:sz="1" w:space="0" w:color="D0CBC0"/>
             </w:tcBorders>
-            <w:shd w:val="clear" w:color="auto" w:fill="F5F0E8"/>
-            <w:tcMar>
-              <w:top w:w="80" w:type="dxa"/>
-              <w:left w:w="120" w:type="dxa"/>
-              <w:bottom w:w="80" w:type="dxa"/>
-              <w:right w:w="80" w:type="dxa"/>
-            </w:tcMar>
-          </w:tcPr>
-          <w:p>
-            <w:pPr>
-              <w:rPr>
-                <w:sz w:val="20"/>
-                <w:szCs w:val="20"/>
-              </w:rPr>
-            </w:pPr>
-            <w:r>
-              <w:rPr>
-                <w:sz w:val="20"/>
-                <w:szCs w:val="20"/>
-              </w:rPr>
-              <w:t>[N/A]</w:t>
+            <w:shd w:val="clear" w:color="auto" w:fill="FFFFFF" w:themeFill="background1"/>
+            <w:tcMar>
+              <w:top w:w="80" w:type="dxa"/>
+              <w:left w:w="120" w:type="dxa"/>
+              <w:bottom w:w="80" w:type="dxa"/>
+              <w:right w:w="80" w:type="dxa"/>
+            </w:tcMar>
+          </w:tcPr>
+          <w:p>
+            <w:pPr>
+              <w:rPr>
+                <w:sz w:val="20"/>
+                <w:szCs w:val="20"/>
+              </w:rPr>
+            </w:pPr>
+            <w:r>
+              <w:rPr>
+                <w:sz w:val="20"/>
+                <w:szCs w:val="20"/>
+              </w:rPr>
+              <w:t>£0.00</w:t>
             </w:r>
           </w:p>
         </w:tc>
@@ -4971,28 +4944,346 @@
               <w:bottom w:val="single" w:sz="1" w:space="0" w:color="D0CBC0"/>
               <w:right w:val="single" w:sz="1" w:space="0" w:color="D0CBC0"/>
             </w:tcBorders>
-            <w:shd w:val="clear" w:color="auto" w:fill="F5F0E8"/>
-            <w:tcMar>
-              <w:top w:w="80" w:type="dxa"/>
-              <w:left w:w="120" w:type="dxa"/>
-              <w:bottom w:w="80" w:type="dxa"/>
-              <w:right w:w="80" w:type="dxa"/>
-            </w:tcMar>
-          </w:tcPr>
-          <w:p>
-            <w:pPr>
-              <w:rPr>
-                <w:sz w:val="20"/>
-                <w:szCs w:val="20"/>
-              </w:rPr>
-            </w:pPr>
-            <w:r>
-              <w:rPr>
-                <w:sz w:val="20"/>
-                <w:szCs w:val="20"/>
-              </w:rPr>
-              <w:t>[~£1.15/month]</w:t>
-            </w:r>
+            <w:shd w:val="clear" w:color="auto" w:fill="FFFFFF" w:themeFill="background1"/>
+            <w:tcMar>
+              <w:top w:w="80" w:type="dxa"/>
+              <w:left w:w="120" w:type="dxa"/>
+              <w:bottom w:w="80" w:type="dxa"/>
+              <w:right w:w="80" w:type="dxa"/>
+            </w:tcMar>
+          </w:tcPr>
+          <w:p>
+            <w:pPr>
+              <w:rPr>
+                <w:sz w:val="20"/>
+                <w:szCs w:val="20"/>
+              </w:rPr>
+            </w:pPr>
+            <w:r>
+              <w:rPr>
+                <w:sz w:val="20"/>
+                <w:szCs w:val="20"/>
+              </w:rPr>
+              <w:t>£0.00</w:t>
+            </w:r>
+          </w:p>
+        </w:tc>
+      </w:tr>
+      <w:tr>
+        <w:tc>
+          <w:tcPr>
+            <w:tcW w:w="2551" w:type="dxa"/>
+            <w:tcBorders>
+              <w:top w:val="single" w:sz="1" w:space="0" w:color="D0CBC0"/>
+              <w:left w:val="single" w:sz="1" w:space="0" w:color="D0CBC0"/>
+              <w:bottom w:val="single" w:sz="1" w:space="0" w:color="D0CBC0"/>
+              <w:right w:val="single" w:sz="1" w:space="0" w:color="D0CBC0"/>
+            </w:tcBorders>
+            <w:shd w:val="clear" w:color="auto" w:fill="FFFFFF" w:themeFill="background1"/>
+            <w:tcMar>
+              <w:top w:w="80" w:type="dxa"/>
+              <w:left w:w="120" w:type="dxa"/>
+              <w:bottom w:w="80" w:type="dxa"/>
+              <w:right w:w="80" w:type="dxa"/>
+            </w:tcMar>
+          </w:tcPr>
+          <w:p>
+            <w:pPr>
+              <w:rPr>
+                <w:sz w:val="20"/>
+                <w:szCs w:val="20"/>
+              </w:rPr>
+            </w:pPr>
+          </w:p>
+        </w:tc>
+        <w:tc>
+          <w:tcPr>
+            <w:tcW w:w="2977" w:type="dxa"/>
+            <w:tcBorders>
+              <w:top w:val="single" w:sz="1" w:space="0" w:color="D0CBC0"/>
+              <w:left w:val="single" w:sz="1" w:space="0" w:color="D0CBC0"/>
+              <w:bottom w:val="single" w:sz="1" w:space="0" w:color="D0CBC0"/>
+              <w:right w:val="single" w:sz="1" w:space="0" w:color="D0CBC0"/>
+            </w:tcBorders>
+            <w:shd w:val="clear" w:color="auto" w:fill="FFFFFF" w:themeFill="background1"/>
+            <w:tcMar>
+              <w:top w:w="80" w:type="dxa"/>
+              <w:left w:w="120" w:type="dxa"/>
+              <w:bottom w:w="80" w:type="dxa"/>
+              <w:right w:w="80" w:type="dxa"/>
+            </w:tcMar>
+          </w:tcPr>
+          <w:p>
+            <w:pPr>
+              <w:rPr>
+                <w:sz w:val="20"/>
+                <w:szCs w:val="20"/>
+              </w:rPr>
+            </w:pPr>
+          </w:p>
+        </w:tc>
+        <w:tc>
+          <w:tcPr>
+            <w:tcW w:w="1842" w:type="dxa"/>
+            <w:tcBorders>
+              <w:top w:val="single" w:sz="1" w:space="0" w:color="D0CBC0"/>
+              <w:left w:val="single" w:sz="1" w:space="0" w:color="D0CBC0"/>
+              <w:bottom w:val="single" w:sz="1" w:space="0" w:color="D0CBC0"/>
+              <w:right w:val="single" w:sz="1" w:space="0" w:color="D0CBC0"/>
+            </w:tcBorders>
+            <w:shd w:val="clear" w:color="auto" w:fill="FFFFFF" w:themeFill="background1"/>
+            <w:tcMar>
+              <w:top w:w="80" w:type="dxa"/>
+              <w:left w:w="120" w:type="dxa"/>
+              <w:bottom w:w="80" w:type="dxa"/>
+              <w:right w:w="80" w:type="dxa"/>
+            </w:tcMar>
+          </w:tcPr>
+          <w:p>
+            <w:pPr>
+              <w:rPr>
+                <w:sz w:val="20"/>
+                <w:szCs w:val="20"/>
+              </w:rPr>
+            </w:pPr>
+          </w:p>
+        </w:tc>
+        <w:tc>
+          <w:tcPr>
+            <w:tcW w:w="2410" w:type="dxa"/>
+            <w:tcBorders>
+              <w:top w:val="single" w:sz="1" w:space="0" w:color="D0CBC0"/>
+              <w:left w:val="single" w:sz="1" w:space="0" w:color="D0CBC0"/>
+              <w:bottom w:val="single" w:sz="1" w:space="0" w:color="D0CBC0"/>
+              <w:right w:val="single" w:sz="1" w:space="0" w:color="D0CBC0"/>
+            </w:tcBorders>
+            <w:shd w:val="clear" w:color="auto" w:fill="FFFFFF" w:themeFill="background1"/>
+            <w:tcMar>
+              <w:top w:w="80" w:type="dxa"/>
+              <w:left w:w="120" w:type="dxa"/>
+              <w:bottom w:w="80" w:type="dxa"/>
+              <w:right w:w="80" w:type="dxa"/>
+            </w:tcMar>
+          </w:tcPr>
+          <w:p>
+            <w:pPr>
+              <w:rPr>
+                <w:sz w:val="20"/>
+                <w:szCs w:val="20"/>
+              </w:rPr>
+            </w:pPr>
+          </w:p>
+        </w:tc>
+      </w:tr>
+      <w:tr>
+        <w:tc>
+          <w:tcPr>
+            <w:tcW w:w="2551" w:type="dxa"/>
+            <w:tcBorders>
+              <w:top w:val="single" w:sz="1" w:space="0" w:color="D0CBC0"/>
+              <w:left w:val="single" w:sz="1" w:space="0" w:color="D0CBC0"/>
+              <w:bottom w:val="single" w:sz="1" w:space="0" w:color="D0CBC0"/>
+              <w:right w:val="single" w:sz="1" w:space="0" w:color="D0CBC0"/>
+            </w:tcBorders>
+            <w:shd w:val="clear" w:color="auto" w:fill="FFFFFF" w:themeFill="background1"/>
+            <w:tcMar>
+              <w:top w:w="80" w:type="dxa"/>
+              <w:left w:w="120" w:type="dxa"/>
+              <w:bottom w:w="80" w:type="dxa"/>
+              <w:right w:w="80" w:type="dxa"/>
+            </w:tcMar>
+          </w:tcPr>
+          <w:p>
+            <w:pPr>
+              <w:rPr>
+                <w:sz w:val="20"/>
+                <w:szCs w:val="20"/>
+              </w:rPr>
+            </w:pPr>
+          </w:p>
+        </w:tc>
+        <w:tc>
+          <w:tcPr>
+            <w:tcW w:w="2977" w:type="dxa"/>
+            <w:tcBorders>
+              <w:top w:val="single" w:sz="1" w:space="0" w:color="D0CBC0"/>
+              <w:left w:val="single" w:sz="1" w:space="0" w:color="D0CBC0"/>
+              <w:bottom w:val="single" w:sz="1" w:space="0" w:color="D0CBC0"/>
+              <w:right w:val="single" w:sz="1" w:space="0" w:color="D0CBC0"/>
+            </w:tcBorders>
+            <w:shd w:val="clear" w:color="auto" w:fill="FFFFFF" w:themeFill="background1"/>
+            <w:tcMar>
+              <w:top w:w="80" w:type="dxa"/>
+              <w:left w:w="120" w:type="dxa"/>
+              <w:bottom w:w="80" w:type="dxa"/>
+              <w:right w:w="80" w:type="dxa"/>
+            </w:tcMar>
+          </w:tcPr>
+          <w:p>
+            <w:pPr>
+              <w:rPr>
+                <w:sz w:val="20"/>
+                <w:szCs w:val="20"/>
+              </w:rPr>
+            </w:pPr>
+          </w:p>
+        </w:tc>
+        <w:tc>
+          <w:tcPr>
+            <w:tcW w:w="1842" w:type="dxa"/>
+            <w:tcBorders>
+              <w:top w:val="single" w:sz="1" w:space="0" w:color="D0CBC0"/>
+              <w:left w:val="single" w:sz="1" w:space="0" w:color="D0CBC0"/>
+              <w:bottom w:val="single" w:sz="1" w:space="0" w:color="D0CBC0"/>
+              <w:right w:val="single" w:sz="1" w:space="0" w:color="D0CBC0"/>
+            </w:tcBorders>
+            <w:shd w:val="clear" w:color="auto" w:fill="FFFFFF" w:themeFill="background1"/>
+            <w:tcMar>
+              <w:top w:w="80" w:type="dxa"/>
+              <w:left w:w="120" w:type="dxa"/>
+              <w:bottom w:w="80" w:type="dxa"/>
+              <w:right w:w="80" w:type="dxa"/>
+            </w:tcMar>
+          </w:tcPr>
+          <w:p>
+            <w:pPr>
+              <w:rPr>
+                <w:sz w:val="20"/>
+                <w:szCs w:val="20"/>
+              </w:rPr>
+            </w:pPr>
+          </w:p>
+        </w:tc>
+        <w:tc>
+          <w:tcPr>
+            <w:tcW w:w="2410" w:type="dxa"/>
+            <w:tcBorders>
+              <w:top w:val="single" w:sz="1" w:space="0" w:color="D0CBC0"/>
+              <w:left w:val="single" w:sz="1" w:space="0" w:color="D0CBC0"/>
+              <w:bottom w:val="single" w:sz="1" w:space="0" w:color="D0CBC0"/>
+              <w:right w:val="single" w:sz="1" w:space="0" w:color="D0CBC0"/>
+            </w:tcBorders>
+            <w:shd w:val="clear" w:color="auto" w:fill="FFFFFF" w:themeFill="background1"/>
+            <w:tcMar>
+              <w:top w:w="80" w:type="dxa"/>
+              <w:left w:w="120" w:type="dxa"/>
+              <w:bottom w:w="80" w:type="dxa"/>
+              <w:right w:w="80" w:type="dxa"/>
+            </w:tcMar>
+          </w:tcPr>
+          <w:p>
+            <w:pPr>
+              <w:rPr>
+                <w:sz w:val="20"/>
+                <w:szCs w:val="20"/>
+              </w:rPr>
+            </w:pPr>
+          </w:p>
+        </w:tc>
+      </w:tr>
+      <w:tr>
+        <w:tc>
+          <w:tcPr>
+            <w:tcW w:w="2551" w:type="dxa"/>
+            <w:tcBorders>
+              <w:top w:val="single" w:sz="1" w:space="0" w:color="D0CBC0"/>
+              <w:left w:val="single" w:sz="1" w:space="0" w:color="D0CBC0"/>
+              <w:bottom w:val="single" w:sz="1" w:space="0" w:color="D0CBC0"/>
+              <w:right w:val="single" w:sz="1" w:space="0" w:color="D0CBC0"/>
+            </w:tcBorders>
+            <w:shd w:val="clear" w:color="auto" w:fill="FFFFFF" w:themeFill="background1"/>
+            <w:tcMar>
+              <w:top w:w="80" w:type="dxa"/>
+              <w:left w:w="120" w:type="dxa"/>
+              <w:bottom w:w="80" w:type="dxa"/>
+              <w:right w:w="80" w:type="dxa"/>
+            </w:tcMar>
+          </w:tcPr>
+          <w:p>
+            <w:pPr>
+              <w:rPr>
+                <w:sz w:val="20"/>
+                <w:szCs w:val="20"/>
+              </w:rPr>
+            </w:pPr>
+          </w:p>
+        </w:tc>
+        <w:tc>
+          <w:tcPr>
+            <w:tcW w:w="2977" w:type="dxa"/>
+            <w:tcBorders>
+              <w:top w:val="single" w:sz="1" w:space="0" w:color="D0CBC0"/>
+              <w:left w:val="single" w:sz="1" w:space="0" w:color="D0CBC0"/>
+              <w:bottom w:val="single" w:sz="1" w:space="0" w:color="D0CBC0"/>
+              <w:right w:val="single" w:sz="1" w:space="0" w:color="D0CBC0"/>
+            </w:tcBorders>
+            <w:shd w:val="clear" w:color="auto" w:fill="FFFFFF" w:themeFill="background1"/>
+            <w:tcMar>
+              <w:top w:w="80" w:type="dxa"/>
+              <w:left w:w="120" w:type="dxa"/>
+              <w:bottom w:w="80" w:type="dxa"/>
+              <w:right w:w="80" w:type="dxa"/>
+            </w:tcMar>
+          </w:tcPr>
+          <w:p>
+            <w:pPr>
+              <w:rPr>
+                <w:sz w:val="20"/>
+                <w:szCs w:val="20"/>
+              </w:rPr>
+            </w:pPr>
+          </w:p>
+        </w:tc>
+        <w:tc>
+          <w:tcPr>
+            <w:tcW w:w="1842" w:type="dxa"/>
+            <w:tcBorders>
+              <w:top w:val="single" w:sz="1" w:space="0" w:color="D0CBC0"/>
+              <w:left w:val="single" w:sz="1" w:space="0" w:color="D0CBC0"/>
+              <w:bottom w:val="single" w:sz="1" w:space="0" w:color="D0CBC0"/>
+              <w:right w:val="single" w:sz="1" w:space="0" w:color="D0CBC0"/>
+            </w:tcBorders>
+            <w:shd w:val="clear" w:color="auto" w:fill="FFFFFF" w:themeFill="background1"/>
+            <w:tcMar>
+              <w:top w:w="80" w:type="dxa"/>
+              <w:left w:w="120" w:type="dxa"/>
+              <w:bottom w:w="80" w:type="dxa"/>
+              <w:right w:w="80" w:type="dxa"/>
+            </w:tcMar>
+          </w:tcPr>
+          <w:p>
+            <w:pPr>
+              <w:rPr>
+                <w:sz w:val="20"/>
+                <w:szCs w:val="20"/>
+              </w:rPr>
+            </w:pPr>
+          </w:p>
+        </w:tc>
+        <w:tc>
+          <w:tcPr>
+            <w:tcW w:w="2410" w:type="dxa"/>
+            <w:tcBorders>
+              <w:top w:val="single" w:sz="1" w:space="0" w:color="D0CBC0"/>
+              <w:left w:val="single" w:sz="1" w:space="0" w:color="D0CBC0"/>
+              <w:bottom w:val="single" w:sz="1" w:space="0" w:color="D0CBC0"/>
+              <w:right w:val="single" w:sz="1" w:space="0" w:color="D0CBC0"/>
+            </w:tcBorders>
+            <w:shd w:val="clear" w:color="auto" w:fill="FFFFFF" w:themeFill="background1"/>
+            <w:tcMar>
+              <w:top w:w="80" w:type="dxa"/>
+              <w:left w:w="120" w:type="dxa"/>
+              <w:bottom w:w="80" w:type="dxa"/>
+              <w:right w:w="80" w:type="dxa"/>
+            </w:tcMar>
+          </w:tcPr>
+          <w:p>
+            <w:pPr>
+              <w:rPr>
+                <w:sz w:val="20"/>
+                <w:szCs w:val="20"/>
+              </w:rPr>
+            </w:pPr>
           </w:p>
         </w:tc>
       </w:tr>
@@ -5056,10 +5347,11 @@
               <w:rPr>
                 <w:b/>
                 <w:bCs/>
-                <w:sz w:val="20"/>
-                <w:szCs w:val="20"/>
-              </w:rPr>
-              <w:t>[£0.00]</w:t>
+                <w:color w:val="C8922A"/>
+                <w:sz w:val="20"/>
+                <w:szCs w:val="20"/>
+              </w:rPr>
+              <w:t>£0.00</w:t>
             </w:r>
           </w:p>
         </w:tc>
@@ -5091,10 +5383,31 @@
               <w:rPr>
                 <w:b/>
                 <w:bCs/>
-                <w:sz w:val="20"/>
-                <w:szCs w:val="20"/>
-              </w:rPr>
-              <w:t>[£X.XX/month]</w:t>
+                <w:color w:val="C8922A"/>
+                <w:sz w:val="20"/>
+                <w:szCs w:val="20"/>
+              </w:rPr>
+              <w:t>£</w:t>
+            </w:r>
+            <w:r>
+              <w:rPr>
+                <w:b/>
+                <w:bCs/>
+                <w:color w:val="C8922A"/>
+                <w:sz w:val="20"/>
+                <w:szCs w:val="20"/>
+              </w:rPr>
+              <w:t>0</w:t>
+            </w:r>
+            <w:r>
+              <w:rPr>
+                <w:b/>
+                <w:bCs/>
+                <w:color w:val="C8922A"/>
+                <w:sz w:val="20"/>
+                <w:szCs w:val="20"/>
+              </w:rPr>
+              <w:t>.00/month</w:t>
             </w:r>
           </w:p>
         </w:tc>
@@ -5203,7 +5516,6 @@
           <w:sz w:val="20"/>
           <w:szCs w:val="20"/>
         </w:rPr>
-        <w:lastRenderedPageBreak/>
         <w:t>Planned improvements for the next version</w:t>
       </w:r>
     </w:p>
@@ -5757,7 +6069,6 @@
         </w:tabs>
       </w:pPr>
       <w:r>
-        <w:lastRenderedPageBreak/>
         <w:t>Serves Static Assets (Optional):</w:t>
       </w:r>
     </w:p>
@@ -7104,6 +7415,15 @@
 </file>
 
 <file path=customXml/item1.xml><?xml version="1.0" encoding="utf-8"?>
+<?mso-contentType ?>
+<FormTemplates xmlns="http://schemas.microsoft.com/sharepoint/v3/contenttype/forms">
+  <Display>DocumentLibraryForm</Display>
+  <Edit>DocumentLibraryForm</Edit>
+  <New>DocumentLibraryForm</New>
+</FormTemplates>
+</file>
+
+<file path=customXml/item2.xml><?xml version="1.0" encoding="utf-8"?>
 <p:properties xmlns:p="http://schemas.microsoft.com/office/2006/metadata/properties" xmlns:xsi="http://www.w3.org/2001/XMLSchema-instance" xmlns:pc="http://schemas.microsoft.com/office/infopath/2007/PartnerControls">
   <documentManagement>
     <TaxCatchAll xmlns="1f02373c-91b9-4d50-88b3-64e98dbf38be" xsi:nil="true"/>
@@ -7112,15 +7432,6 @@
     </lcf76f155ced4ddcb4097134ff3c332f>
   </documentManagement>
 </p:properties>
-</file>
-
-<file path=customXml/item2.xml><?xml version="1.0" encoding="utf-8"?>
-<?mso-contentType ?>
-<FormTemplates xmlns="http://schemas.microsoft.com/sharepoint/v3/contenttype/forms">
-  <Display>DocumentLibraryForm</Display>
-  <Edit>DocumentLibraryForm</Edit>
-  <New>DocumentLibraryForm</New>
-</FormTemplates>
 </file>
 
 <file path=customXml/item3.xml><?xml version="1.0" encoding="utf-8"?>
@@ -7331,20 +7642,20 @@
 </file>
 
 <file path=customXml/itemProps1.xml><?xml version="1.0" encoding="utf-8"?>
+<ds:datastoreItem xmlns:ds="http://schemas.openxmlformats.org/officeDocument/2006/customXml" ds:itemID="{CE4BE2F9-5067-4088-9F9B-1F3D17ABA8D7}">
+  <ds:schemaRefs>
+    <ds:schemaRef ds:uri="http://schemas.microsoft.com/sharepoint/v3/contenttype/forms"/>
+  </ds:schemaRefs>
+</ds:datastoreItem>
+</file>
+
+<file path=customXml/itemProps2.xml><?xml version="1.0" encoding="utf-8"?>
 <ds:datastoreItem xmlns:ds="http://schemas.openxmlformats.org/officeDocument/2006/customXml" ds:itemID="{82E5BD80-5074-4316-B334-2041375E4FBF}">
   <ds:schemaRefs>
     <ds:schemaRef ds:uri="http://schemas.microsoft.com/office/2006/metadata/properties"/>
     <ds:schemaRef ds:uri="http://schemas.microsoft.com/office/infopath/2007/PartnerControls"/>
     <ds:schemaRef ds:uri="1f02373c-91b9-4d50-88b3-64e98dbf38be"/>
     <ds:schemaRef ds:uri="833209ff-be3b-48c0-8c17-04759cd24c23"/>
-  </ds:schemaRefs>
-</ds:datastoreItem>
-</file>
-
-<file path=customXml/itemProps2.xml><?xml version="1.0" encoding="utf-8"?>
-<ds:datastoreItem xmlns:ds="http://schemas.openxmlformats.org/officeDocument/2006/customXml" ds:itemID="{CE4BE2F9-5067-4088-9F9B-1F3D17ABA8D7}">
-  <ds:schemaRefs>
-    <ds:schemaRef ds:uri="http://schemas.microsoft.com/sharepoint/v3/contenttype/forms"/>
   </ds:schemaRefs>
 </ds:datastoreItem>
 </file>

</xml_diff>